<commit_message>
docs: 更新 README v1.12 及使用說明 Word 文件
- README 新增匯出功能說明（Excel/截圖）、班次記錄手動儲存說明
- 版本歷程新增 v1.12
- 方向箭頭說明更新（108 模式修正描述）
- Word 文件同步更新版本表與功能章節

Co-Authored-By: Claude Sonnet 4.6 <noreply@anthropic.com>
</commit_message>
<xml_diff>
--- a/貓空纜車調度系統使用說明1150531.docx
+++ b/貓空纜車調度系統使用說明1150531.docx
@@ -8004,6 +8004,30 @@
         <w:pStyle w:val="Heading2"/>
       </w:pPr>
       <w:r>
+        <w:t>匯出功能（v1.12 新增）</w:t>
+      </w:r>
+    </w:p>
+    <w:p>
+      <w:pPr>
+        <w:pStyle w:val="Heading2"/>
+      </w:pPr>
+      <w:r>
+        <w:t>📷 截圖：擷取整個調度畫面（含左右儲車區、正線迴圈、中央面板），存為 2× 解析度 .png，可直接印出或傳送。</w:t>
+      </w:r>
+    </w:p>
+    <w:p>
+      <w:pPr>
+        <w:pStyle w:val="Heading2"/>
+      </w:pPr>
+      <w:r>
+        <w:t>📊 Excel：下載 .xlsx，含 5 個工作表（正線排列、車廂狀態、自定義區、維修排程、週排程），檔名自動帶台北時間。</w:t>
+      </w:r>
+    </w:p>
+    <w:p>
+      <w:pPr>
+        <w:pStyle w:val="Heading2"/>
+      </w:pPr>
+      <w:r>
         <w:rPr>
           <w:rFonts w:hint="eastAsia"/>
         </w:rPr>
@@ -8755,6 +8779,67 @@
             </w:r>
             <w:r>
               <w:t xml:space="preserve"> 16px</w:t>
+            </w:r>
+          </w:p>
+        </w:tc>
+      </w:tr>
+      <w:tr>
+        <w:tc>
+          <w:tcPr/>
+          <w:p>
+            <w:pPr>
+              <w:pStyle w:val="Compact"/>
+            </w:pPr>
+            <w:r/>
+            <w:r>
+              <w:t>v1.12</w:t>
+            </w:r>
+          </w:p>
+        </w:tc>
+        <w:tc>
+          <w:tcPr/>
+          <w:p>
+            <w:pPr>
+              <w:pStyle w:val="Compact"/>
+            </w:pPr>
+            <w:r/>
+            <w:r>
+              <w:t>2026-05-31</w:t>
+            </w:r>
+          </w:p>
+        </w:tc>
+        <w:tc>
+          <w:tcPr/>
+          <w:p>
+            <w:pPr>
+              <w:pStyle w:val="Compact"/>
+            </w:pPr>
+            <w:r>
+              <w:rPr>
+                <w:rFonts w:hint="eastAsia"/>
+              </w:rPr>
+            </w:r>
+            <w:r/>
+            <w:r>
+              <w:rPr>
+                <w:rFonts w:hint="eastAsia"/>
+              </w:rPr>
+            </w:r>
+            <w:r/>
+            <w:r>
+              <w:rPr>
+                <w:rFonts w:hint="eastAsia"/>
+              </w:rPr>
+            </w:r>
+            <w:r/>
+            <w:r>
+              <w:rPr>
+                <w:rFonts w:hint="eastAsia"/>
+              </w:rPr>
+            </w:r>
+            <w:r/>
+            <w:r>
+              <w:t>修復 108 模式 ← 方向箭頭消失（動態計算上下排中間格位）；班次記錄 Panel 加入手動儲存快照；TopBar 新增 📊 Excel 匯出（5 工作表）與 📷 截圖功能</w:t>
             </w:r>
           </w:p>
         </w:tc>

</xml_diff>